<commit_message>
Rename add-in from 'Kiser Invoice Tools' to 'Project Update'
User-facing strings updated in both manifests and the task pane:
- DisplayName, ribbon Group label, button label, supertip / tooltip
- GetStarted title + description
- taskpane.html page <title>
- Install guide step 5 (button name + screenshot caption)

The add-in's Id GUID is unchanged so existing installs continue to load
the same manifest URL; the new name will appear after Office re-fetches
the manifest (sign-out / sign-in or cache flush).

Co-Authored-By: Claude Opus 4.7 (1M context) <noreply@anthropic.com>
</commit_message>
<xml_diff>
--- a/Install_Guide_Kiser_Invoice_Tools.docx
+++ b/Install_Guide_Kiser_Invoice_Tools.docx
@@ -152,7 +152,7 @@
             <w:pPr>
               <w:spacing w:after="60"/>
             </w:pPr>
-            <w:hyperlink w:history="1" r:id="rId24fcfszag7ffowulgxtss">
+            <w:hyperlink w:history="1" r:id="rIdbrwk-ix9rdlviwfgdnk3z">
               <w:r>
                 <w:rPr>
                   <w:rStyle w:val="Hyperlink"/>
@@ -1173,7 +1173,7 @@
                 <w:sz w:val="28"/>
                 <w:szCs w:val="28"/>
               </w:rPr>
-              <w:t xml:space="preserve">Click Kiser Invoice Tools</w:t>
+              <w:t xml:space="preserve">Click Project Update</w:t>
             </w:r>
           </w:p>
           <w:p>
@@ -1187,7 +1187,7 @@
                 <w:sz w:val="22"/>
                 <w:szCs w:val="22"/>
               </w:rPr>
-              <w:t xml:space="preserve">A new Kiser Invoice Tools button (green K) appears on the Home tab. Click it — the panel opens on the right side of Excel.</w:t>
+              <w:t xml:space="preserve">A new Project Update button (green K) appears on the Home tab. Click it — the panel opens on the right side of Excel.</w:t>
             </w:r>
           </w:p>
         </w:tc>
@@ -1218,7 +1218,7 @@
           <wp:inline distT="0" distB="0" distL="0" distR="0">
             <wp:extent cx="4381500" cy="666750"/>
             <wp:effectExtent t="0" r="0" b="0" l="0"/>
-            <wp:docPr id="1" name="step-5" descr="Kiser Invoice Tools button" title="Kiser Invoice Tools button"/>
+            <wp:docPr id="1" name="step-5" descr="Project Update button" title="Project Update button"/>
             <wp:cNvGraphicFramePr>
               <a:graphicFrameLocks xmlns:a="http://schemas.openxmlformats.org/drawingml/2006/main" noChangeAspect="1"/>
             </wp:cNvGraphicFramePr>
@@ -1268,7 +1268,7 @@
           <w:sz w:val="18"/>
           <w:szCs w:val="18"/>
         </w:rPr>
-        <w:t xml:space="preserve">Kiser Invoice Tools button</w:t>
+        <w:t xml:space="preserve">Project Update button</w:t>
       </w:r>
     </w:p>
     <w:p>

</xml_diff>